<commit_message>
GitHub bağlantısı ekle ve kod/README'de öğrenci numarasını maskele
Rapor ve sunumun kapağına/son slaytına proje deposu bağlantısı eklendi.
kod/README.md'deki öğrenci numarası gizlilik için maskelendi (*********47);
böylece public repoda hiçbir metinde tam numara kalmadı. sunum/ klasöründeki
maskeli kopyalar bağlantı eklenmiş hâliyle yeniden üretildi.
</commit_message>
<xml_diff>
--- a/sunum/Rapor_KubilayInanc.docx
+++ b/sunum/Rapor_KubilayInanc.docx
@@ -211,6 +211,22 @@
           <w:szCs w:val="24"/>
         </w:rPr>
         <w:t xml:space="preserve">BURSA</w:t>
+      </w:r>
+    </w:p>
+    <w:p>
+      <w:pPr>
+        <w:spacing w:after="0" w:before="360"/>
+        <w:jc w:val="center"/>
+      </w:pPr>
+      <w:r>
+        <w:rPr>
+          <w:i/>
+          <w:iCs/>
+          <w:color w:val="555555"/>
+          <w:sz w:val="18"/>
+          <w:szCs w:val="18"/>
+        </w:rPr>
+        <w:t xml:space="preserve">Proje kodu: github.com/MandallF/qlearning-vs-sarsa-lavafield</w:t>
       </w:r>
     </w:p>
     <w:p>

</xml_diff>